<commit_message>
Completed Module 8 except for Final Project
</commit_message>
<xml_diff>
--- a/Module_7/Discussion_Post.docx
+++ b/Module_7/Discussion_Post.docx
@@ -13,25 +13,16 @@
         <w:t>a course I took during my first go at higher education was a calculator application built using C++.</w:t>
       </w:r>
       <w:r>
-        <w:t xml:space="preserve"> It was quite the challenge trying to develop all the input methods and buttons for each possibility the user could enter</w:t>
+        <w:t xml:space="preserve"> It was quite </w:t>
+      </w:r>
+      <w:r>
+        <w:t>a</w:t>
+      </w:r>
+      <w:r>
+        <w:t xml:space="preserve"> challenge trying to develop all the input methods and buttons for each possibility the user could enter</w:t>
       </w:r>
       <w:r>
         <w:t>, and that was not accounting for all of the scientific, graphing, and conversion functions many modern calculators offer!</w:t>
-      </w:r>
-    </w:p>
-    <w:p>
-      <w:pPr>
-        <w:numPr>
-          <w:ilvl w:val="0"/>
-          <w:numId w:val="1"/>
-        </w:numPr>
-      </w:pPr>
-      <w:r>
-        <w:t>Foundations of Computer Graphics:</w:t>
-      </w:r>
-      <w:r>
-        <w:br/>
-        <w:t>What are the basic differences between vector and raster graphics? Can you give examples of where each type is commonly used?</w:t>
       </w:r>
     </w:p>
     <w:p>
@@ -57,54 +48,138 @@
         <w:t xml:space="preserve">The </w:t>
       </w:r>
       <w:r>
-        <w:t xml:space="preserve">sharpness of vector graphics make them less ideal </w:t>
+        <w:t>sharpness of vector graphics make</w:t>
+      </w:r>
+      <w:r>
+        <w:t>s</w:t>
+      </w:r>
+      <w:r>
+        <w:t xml:space="preserve"> them less ideal </w:t>
       </w:r>
       <w:r>
         <w:t xml:space="preserve">for </w:t>
       </w:r>
       <w:r>
         <w:t>items that need a more nuanced or gradual color change between certain areas.</w:t>
-      </w:r>
-    </w:p>
-    <w:p>
-      <w:pPr>
-        <w:numPr>
-          <w:ilvl w:val="0"/>
-          <w:numId w:val="1"/>
-        </w:numPr>
-      </w:pPr>
-      <w:r>
-        <w:t>Color and Visual Design:</w:t>
-      </w:r>
-      <w:r>
-        <w:br/>
-        <w:t>How does color representation (such as RGB or CMYK) affect the way images are displayed on different devices? Why is color management important in computer graphics?</w:t>
       </w:r>
     </w:p>
     <w:p>
       <w:pPr>
         <w:ind w:left="720"/>
       </w:pPr>
-    </w:p>
-    <w:p>
-      <w:pPr>
-        <w:numPr>
-          <w:ilvl w:val="0"/>
-          <w:numId w:val="1"/>
-        </w:numPr>
-      </w:pPr>
-      <w:r>
-        <w:t>Applications of Computer Graphics:</w:t>
-      </w:r>
-      <w:r>
-        <w:br/>
-        <w:t>In what ways do we see computer graphics used in everyday life—such as in movies, video games, education, or advertising—and what makes these visuals engaging or effective?</w:t>
+      <w:r>
+        <w:t xml:space="preserve">RGB and CMYK differ in that they are inverse methods of generating color. RGB is an additive method, where colors are added together to create </w:t>
+      </w:r>
+      <w:r>
+        <w:t xml:space="preserve">different colors with light. CMYK is a subtractive method </w:t>
+      </w:r>
+      <w:r>
+        <w:t>where ink is layered on top of a white paper to creat</w:t>
+      </w:r>
+      <w:r>
+        <w:t xml:space="preserve">e different colors getting closer to black as more ink is added. Another difference is the </w:t>
+      </w:r>
+      <w:r>
+        <w:t>number</w:t>
+      </w:r>
+      <w:r>
+        <w:t xml:space="preserve"> of colors each method can produce. RGB can generate </w:t>
+      </w:r>
+      <w:r>
+        <w:t>a far greater number of colors, being capable of nearly 17 million colors. CMYK</w:t>
+      </w:r>
+      <w:r>
+        <w:t xml:space="preserve"> is constrained by the practical limitations of the physical printing process</w:t>
+      </w:r>
+      <w:r>
+        <w:t xml:space="preserve"> so a significantly smaller number of colors. Color management is incredibly important</w:t>
+      </w:r>
+      <w:r>
+        <w:t xml:space="preserve"> in computer graphics because it affects not only what the user sees on the screen, but can also affect the battery / power usage of the device</w:t>
+      </w:r>
+      <w:r>
+        <w:t xml:space="preserve"> being used to display the graphics. Some people are also color blind and may not be able to see certain graphics if they are </w:t>
+      </w:r>
+      <w:r>
+        <w:t>displayed</w:t>
+      </w:r>
+      <w:r>
+        <w:t xml:space="preserve"> in certain colors</w:t>
+      </w:r>
+      <w:r>
+        <w:t>.</w:t>
       </w:r>
     </w:p>
     <w:p>
       <w:pPr>
         <w:ind w:left="720"/>
       </w:pPr>
+      <w:r>
+        <w:t>Nearly all video games contain computer generated images, as do a significant number of movies</w:t>
+      </w:r>
+      <w:r>
+        <w:t xml:space="preserve"> these days. Modern day advertising is nearly entirely built upon graphic design</w:t>
+      </w:r>
+      <w:r>
+        <w:t xml:space="preserve">, so this is another facet of computer graphics that we interact with on a daily basis. One prime example where these </w:t>
+      </w:r>
+      <w:r>
+        <w:t>different mediums come together is during the Super Bowl. Super Bowl commercials are famous for their use of highly engaging</w:t>
+      </w:r>
+      <w:r>
+        <w:t>, over-the-top graphics and videos. Many people</w:t>
+      </w:r>
+      <w:r>
+        <w:t xml:space="preserve"> even</w:t>
+      </w:r>
+      <w:r>
+        <w:t xml:space="preserve"> tune in solely for </w:t>
+      </w:r>
+      <w:r>
+        <w:t xml:space="preserve">these annual displays! </w:t>
+      </w:r>
+      <w:r>
+        <w:t>Their design covers the entire</w:t>
+      </w:r>
+      <w:r>
+        <w:t xml:space="preserve"> color</w:t>
+      </w:r>
+      <w:r>
+        <w:t xml:space="preserve"> spectrum</w:t>
+      </w:r>
+      <w:r>
+        <w:t xml:space="preserve"> </w:t>
+      </w:r>
+      <w:r>
+        <w:t xml:space="preserve">from vibrant flashy </w:t>
+      </w:r>
+      <w:r>
+        <w:t xml:space="preserve">sports cars </w:t>
+      </w:r>
+      <w:r>
+        <w:t xml:space="preserve">to somber muted </w:t>
+      </w:r>
+      <w:r>
+        <w:t>backdrops.</w:t>
+      </w:r>
+      <w:r>
+        <w:t xml:space="preserve"> Often incorporating celebrities and famous songs</w:t>
+      </w:r>
+      <w:r>
+        <w:t>, these graphics are designed to draw in the viewer as quickly and efficiently as possible.</w:t>
+      </w:r>
+    </w:p>
+    <w:p>
+      <w:pPr>
+        <w:ind w:left="720"/>
+      </w:pPr>
+      <w:r>
+        <w:lastRenderedPageBreak/>
+        <w:t xml:space="preserve">Comparing these big-budget commercials to the beginner graphics programs we are designing, </w:t>
+      </w:r>
+      <w:r>
+        <w:t>how many developers do you think are involved in the making of a Super Bowl commercial? What processes or design engines do you think are being used?</w:t>
+      </w:r>
     </w:p>
     <w:p/>
     <w:sectPr>

</xml_diff>